<commit_message>
Publish current project structure and documentation
</commit_message>
<xml_diff>
--- a/innovative_solution/thesis/基于机器学习的TFT-LCD多工序质量特性预测研究.docx
+++ b/innovative_solution/thesis/基于机器学习的TFT-LCD多工序质量特性预测研究.docx
@@ -75,7 +75,7 @@
         <w:pStyle w:val="1"/>
         <w:spacing w:before="0" w:after="160"/>
       </w:pPr>
-      <w:bookmarkStart w:id="0" w:name="_Toc240182072"/>
+      <w:bookmarkStart w:id="0" w:name="_Toc240186975"/>
       <w:r>
         <w:rPr>
           <w:rFonts w:ascii="Times New Roman" w:eastAsia="黑体" w:hAnsi="Times New Roman"/>
@@ -437,7 +437,7 @@
         <w:pageBreakBefore/>
         <w:spacing w:before="0" w:after="160"/>
       </w:pPr>
-      <w:bookmarkStart w:id="1" w:name="_Toc240182073"/>
+      <w:bookmarkStart w:id="1" w:name="_Toc240186976"/>
       <w:r>
         <w:rPr>
           <w:rFonts w:ascii="Times New Roman" w:eastAsia="黑体" w:hAnsi="Times New Roman"/>
@@ -564,7 +564,7 @@
         </w:rPr>
         <w:fldChar w:fldCharType="separate"/>
       </w:r>
-      <w:hyperlink w:anchor="_Toc240182072" w:history="1">
+      <w:hyperlink w:anchor="_Toc240186975" w:history="1">
         <w:r>
           <w:rPr>
             <w:rStyle w:val="aff9"/>
@@ -607,7 +607,7 @@
             <w:webHidden/>
             <w:sz w:val="21"/>
           </w:rPr>
-          <w:instrText>PAGEREF _Toc240182072 \h</w:instrText>
+          <w:instrText>PAGEREF _Toc240186975 \h</w:instrText>
         </w:r>
         <w:r>
           <w:rPr>
@@ -671,7 +671,7 @@
           <w14:ligatures w14:val="standardContextual"/>
         </w:rPr>
       </w:pPr>
-      <w:hyperlink w:anchor="_Toc240182073" w:history="1">
+      <w:hyperlink w:anchor="_Toc240186976" w:history="1">
         <w:r>
           <w:rPr>
             <w:rStyle w:val="aff9"/>
@@ -714,7 +714,7 @@
             <w:webHidden/>
             <w:sz w:val="21"/>
           </w:rPr>
-          <w:instrText>PAGEREF _Toc240182073 \h</w:instrText>
+          <w:instrText>PAGEREF _Toc240186976 \h</w:instrText>
         </w:r>
         <w:r>
           <w:rPr>
@@ -778,7 +778,7 @@
           <w14:ligatures w14:val="standardContextual"/>
         </w:rPr>
       </w:pPr>
-      <w:hyperlink w:anchor="_Toc240182074" w:history="1">
+      <w:hyperlink w:anchor="_Toc240186977" w:history="1">
         <w:r>
           <w:rPr>
             <w:rStyle w:val="aff9"/>
@@ -830,7 +830,7 @@
             <w:webHidden/>
             <w:sz w:val="21"/>
           </w:rPr>
-          <w:instrText>PAGEREF _Toc240182074 \h</w:instrText>
+          <w:instrText>PAGEREF _Toc240186977 \h</w:instrText>
         </w:r>
         <w:r>
           <w:rPr>
@@ -895,7 +895,7 @@
           <w14:ligatures w14:val="standardContextual"/>
         </w:rPr>
       </w:pPr>
-      <w:hyperlink w:anchor="_Toc240182075" w:history="1">
+      <w:hyperlink w:anchor="_Toc240186978" w:history="1">
         <w:r>
           <w:rPr>
             <w:rStyle w:val="aff9"/>
@@ -947,7 +947,7 @@
             <w:webHidden/>
             <w:sz w:val="21"/>
           </w:rPr>
-          <w:instrText>PAGEREF _Toc240182075 \h</w:instrText>
+          <w:instrText>PAGEREF _Toc240186978 \h</w:instrText>
         </w:r>
         <w:r>
           <w:rPr>
@@ -1012,7 +1012,7 @@
           <w14:ligatures w14:val="standardContextual"/>
         </w:rPr>
       </w:pPr>
-      <w:hyperlink w:anchor="_Toc240182076" w:history="1">
+      <w:hyperlink w:anchor="_Toc240186979" w:history="1">
         <w:r>
           <w:rPr>
             <w:rStyle w:val="aff9"/>
@@ -1064,7 +1064,7 @@
             <w:webHidden/>
             <w:sz w:val="21"/>
           </w:rPr>
-          <w:instrText>PAGEREF _Toc240182076 \h</w:instrText>
+          <w:instrText>PAGEREF _Toc240186979 \h</w:instrText>
         </w:r>
         <w:r>
           <w:rPr>
@@ -1129,7 +1129,7 @@
           <w14:ligatures w14:val="standardContextual"/>
         </w:rPr>
       </w:pPr>
-      <w:hyperlink w:anchor="_Toc240182077" w:history="1">
+      <w:hyperlink w:anchor="_Toc240186980" w:history="1">
         <w:r>
           <w:rPr>
             <w:rStyle w:val="aff9"/>
@@ -1181,7 +1181,7 @@
             <w:webHidden/>
             <w:sz w:val="21"/>
           </w:rPr>
-          <w:instrText>PAGEREF _Toc240182077 \h</w:instrText>
+          <w:instrText>PAGEREF _Toc240186980 \h</w:instrText>
         </w:r>
         <w:r>
           <w:rPr>
@@ -1245,7 +1245,7 @@
           <w14:ligatures w14:val="standardContextual"/>
         </w:rPr>
       </w:pPr>
-      <w:hyperlink w:anchor="_Toc240182078" w:history="1">
+      <w:hyperlink w:anchor="_Toc240186981" w:history="1">
         <w:r>
           <w:rPr>
             <w:rStyle w:val="aff9"/>
@@ -1297,7 +1297,7 @@
             <w:webHidden/>
             <w:sz w:val="21"/>
           </w:rPr>
-          <w:instrText>PAGEREF _Toc240182078 \h</w:instrText>
+          <w:instrText>PAGEREF _Toc240186981 \h</w:instrText>
         </w:r>
         <w:r>
           <w:rPr>
@@ -1362,7 +1362,7 @@
           <w14:ligatures w14:val="standardContextual"/>
         </w:rPr>
       </w:pPr>
-      <w:hyperlink w:anchor="_Toc240182079" w:history="1">
+      <w:hyperlink w:anchor="_Toc240186982" w:history="1">
         <w:r>
           <w:rPr>
             <w:rStyle w:val="aff9"/>
@@ -1414,7 +1414,7 @@
             <w:webHidden/>
             <w:sz w:val="21"/>
           </w:rPr>
-          <w:instrText>PAGEREF _Toc240182079 \h</w:instrText>
+          <w:instrText>PAGEREF _Toc240186982 \h</w:instrText>
         </w:r>
         <w:r>
           <w:rPr>
@@ -1479,7 +1479,7 @@
           <w14:ligatures w14:val="standardContextual"/>
         </w:rPr>
       </w:pPr>
-      <w:hyperlink w:anchor="_Toc240182080" w:history="1">
+      <w:hyperlink w:anchor="_Toc240186983" w:history="1">
         <w:r>
           <w:rPr>
             <w:rStyle w:val="aff9"/>
@@ -1531,7 +1531,7 @@
             <w:webHidden/>
             <w:sz w:val="21"/>
           </w:rPr>
-          <w:instrText>PAGEREF _Toc240182080 \h</w:instrText>
+          <w:instrText>PAGEREF _Toc240186983 \h</w:instrText>
         </w:r>
         <w:r>
           <w:rPr>
@@ -1596,7 +1596,7 @@
           <w14:ligatures w14:val="standardContextual"/>
         </w:rPr>
       </w:pPr>
-      <w:hyperlink w:anchor="_Toc240182081" w:history="1">
+      <w:hyperlink w:anchor="_Toc240186984" w:history="1">
         <w:r>
           <w:rPr>
             <w:rStyle w:val="aff9"/>
@@ -1648,7 +1648,7 @@
             <w:webHidden/>
             <w:sz w:val="21"/>
           </w:rPr>
-          <w:instrText>PAGEREF _Toc240182081 \h</w:instrText>
+          <w:instrText>PAGEREF _Toc240186984 \h</w:instrText>
         </w:r>
         <w:r>
           <w:rPr>
@@ -1713,7 +1713,7 @@
           <w14:ligatures w14:val="standardContextual"/>
         </w:rPr>
       </w:pPr>
-      <w:hyperlink w:anchor="_Toc240182082" w:history="1">
+      <w:hyperlink w:anchor="_Toc240186985" w:history="1">
         <w:r>
           <w:rPr>
             <w:rStyle w:val="aff9"/>
@@ -1765,7 +1765,7 @@
             <w:webHidden/>
             <w:sz w:val="21"/>
           </w:rPr>
-          <w:instrText>PAGEREF _Toc240182082 \h</w:instrText>
+          <w:instrText>PAGEREF _Toc240186985 \h</w:instrText>
         </w:r>
         <w:r>
           <w:rPr>
@@ -1829,7 +1829,7 @@
           <w14:ligatures w14:val="standardContextual"/>
         </w:rPr>
       </w:pPr>
-      <w:hyperlink w:anchor="_Toc240182083" w:history="1">
+      <w:hyperlink w:anchor="_Toc240186986" w:history="1">
         <w:r>
           <w:rPr>
             <w:rStyle w:val="aff9"/>
@@ -1881,7 +1881,7 @@
             <w:webHidden/>
             <w:sz w:val="21"/>
           </w:rPr>
-          <w:instrText>PAGEREF _Toc240182083 \h</w:instrText>
+          <w:instrText>PAGEREF _Toc240186986 \h</w:instrText>
         </w:r>
         <w:r>
           <w:rPr>
@@ -1946,7 +1946,7 @@
           <w14:ligatures w14:val="standardContextual"/>
         </w:rPr>
       </w:pPr>
-      <w:hyperlink w:anchor="_Toc240182084" w:history="1">
+      <w:hyperlink w:anchor="_Toc240186987" w:history="1">
         <w:r>
           <w:rPr>
             <w:rStyle w:val="aff9"/>
@@ -1998,7 +1998,7 @@
             <w:webHidden/>
             <w:sz w:val="21"/>
           </w:rPr>
-          <w:instrText>PAGEREF _Toc240182084 \h</w:instrText>
+          <w:instrText>PAGEREF _Toc240186987 \h</w:instrText>
         </w:r>
         <w:r>
           <w:rPr>
@@ -2063,7 +2063,7 @@
           <w14:ligatures w14:val="standardContextual"/>
         </w:rPr>
       </w:pPr>
-      <w:hyperlink w:anchor="_Toc240182085" w:history="1">
+      <w:hyperlink w:anchor="_Toc240186988" w:history="1">
         <w:r>
           <w:rPr>
             <w:rStyle w:val="aff9"/>
@@ -2115,7 +2115,7 @@
             <w:webHidden/>
             <w:sz w:val="21"/>
           </w:rPr>
-          <w:instrText>PAGEREF _Toc240182085 \h</w:instrText>
+          <w:instrText>PAGEREF _Toc240186988 \h</w:instrText>
         </w:r>
         <w:r>
           <w:rPr>
@@ -2180,7 +2180,7 @@
           <w14:ligatures w14:val="standardContextual"/>
         </w:rPr>
       </w:pPr>
-      <w:hyperlink w:anchor="_Toc240182086" w:history="1">
+      <w:hyperlink w:anchor="_Toc240186989" w:history="1">
         <w:r>
           <w:rPr>
             <w:rStyle w:val="aff9"/>
@@ -2232,7 +2232,7 @@
             <w:webHidden/>
             <w:sz w:val="21"/>
           </w:rPr>
-          <w:instrText>PAGEREF _Toc240182086 \h</w:instrText>
+          <w:instrText>PAGEREF _Toc240186989 \h</w:instrText>
         </w:r>
         <w:r>
           <w:rPr>
@@ -2297,7 +2297,7 @@
           <w14:ligatures w14:val="standardContextual"/>
         </w:rPr>
       </w:pPr>
-      <w:hyperlink w:anchor="_Toc240182087" w:history="1">
+      <w:hyperlink w:anchor="_Toc240186990" w:history="1">
         <w:r>
           <w:rPr>
             <w:rStyle w:val="aff9"/>
@@ -2349,7 +2349,7 @@
             <w:webHidden/>
             <w:sz w:val="21"/>
           </w:rPr>
-          <w:instrText>PAGEREF _Toc240182087 \h</w:instrText>
+          <w:instrText>PAGEREF _Toc240186990 \h</w:instrText>
         </w:r>
         <w:r>
           <w:rPr>
@@ -2414,7 +2414,7 @@
           <w14:ligatures w14:val="standardContextual"/>
         </w:rPr>
       </w:pPr>
-      <w:hyperlink w:anchor="_Toc240182088" w:history="1">
+      <w:hyperlink w:anchor="_Toc240186991" w:history="1">
         <w:r>
           <w:rPr>
             <w:rStyle w:val="aff9"/>
@@ -2466,7 +2466,7 @@
             <w:webHidden/>
             <w:sz w:val="21"/>
           </w:rPr>
-          <w:instrText>PAGEREF _Toc240182088 \h</w:instrText>
+          <w:instrText>PAGEREF _Toc240186991 \h</w:instrText>
         </w:r>
         <w:r>
           <w:rPr>
@@ -2531,7 +2531,7 @@
           <w14:ligatures w14:val="standardContextual"/>
         </w:rPr>
       </w:pPr>
-      <w:hyperlink w:anchor="_Toc240182089" w:history="1">
+      <w:hyperlink w:anchor="_Toc240186992" w:history="1">
         <w:r>
           <w:rPr>
             <w:rStyle w:val="aff9"/>
@@ -2583,7 +2583,7 @@
             <w:webHidden/>
             <w:sz w:val="21"/>
           </w:rPr>
-          <w:instrText>PAGEREF _Toc240182089 \h</w:instrText>
+          <w:instrText>PAGEREF _Toc240186992 \h</w:instrText>
         </w:r>
         <w:r>
           <w:rPr>
@@ -2647,7 +2647,7 @@
           <w14:ligatures w14:val="standardContextual"/>
         </w:rPr>
       </w:pPr>
-      <w:hyperlink w:anchor="_Toc240182090" w:history="1">
+      <w:hyperlink w:anchor="_Toc240186993" w:history="1">
         <w:r>
           <w:rPr>
             <w:rStyle w:val="aff9"/>
@@ -2699,7 +2699,7 @@
             <w:webHidden/>
             <w:sz w:val="21"/>
           </w:rPr>
-          <w:instrText>PAGEREF _Toc240182090 \h</w:instrText>
+          <w:instrText>PAGEREF _Toc240186993 \h</w:instrText>
         </w:r>
         <w:r>
           <w:rPr>
@@ -2764,7 +2764,7 @@
           <w14:ligatures w14:val="standardContextual"/>
         </w:rPr>
       </w:pPr>
-      <w:hyperlink w:anchor="_Toc240182091" w:history="1">
+      <w:hyperlink w:anchor="_Toc240186994" w:history="1">
         <w:r>
           <w:rPr>
             <w:rStyle w:val="aff9"/>
@@ -2816,7 +2816,7 @@
             <w:webHidden/>
             <w:sz w:val="21"/>
           </w:rPr>
-          <w:instrText>PAGEREF _Toc240182091 \h</w:instrText>
+          <w:instrText>PAGEREF _Toc240186994 \h</w:instrText>
         </w:r>
         <w:r>
           <w:rPr>
@@ -2881,7 +2881,7 @@
           <w14:ligatures w14:val="standardContextual"/>
         </w:rPr>
       </w:pPr>
-      <w:hyperlink w:anchor="_Toc240182092" w:history="1">
+      <w:hyperlink w:anchor="_Toc240186995" w:history="1">
         <w:r>
           <w:rPr>
             <w:rStyle w:val="aff9"/>
@@ -2933,7 +2933,7 @@
             <w:webHidden/>
             <w:sz w:val="21"/>
           </w:rPr>
-          <w:instrText>PAGEREF _Toc240182092 \h</w:instrText>
+          <w:instrText>PAGEREF _Toc240186995 \h</w:instrText>
         </w:r>
         <w:r>
           <w:rPr>
@@ -2998,7 +2998,7 @@
           <w14:ligatures w14:val="standardContextual"/>
         </w:rPr>
       </w:pPr>
-      <w:hyperlink w:anchor="_Toc240182093" w:history="1">
+      <w:hyperlink w:anchor="_Toc240186996" w:history="1">
         <w:r>
           <w:rPr>
             <w:rStyle w:val="aff9"/>
@@ -3050,7 +3050,7 @@
             <w:webHidden/>
             <w:sz w:val="21"/>
           </w:rPr>
-          <w:instrText>PAGEREF _Toc240182093 \h</w:instrText>
+          <w:instrText>PAGEREF _Toc240186996 \h</w:instrText>
         </w:r>
         <w:r>
           <w:rPr>
@@ -3115,7 +3115,7 @@
           <w14:ligatures w14:val="standardContextual"/>
         </w:rPr>
       </w:pPr>
-      <w:hyperlink w:anchor="_Toc240182094" w:history="1">
+      <w:hyperlink w:anchor="_Toc240186997" w:history="1">
         <w:r>
           <w:rPr>
             <w:rStyle w:val="aff9"/>
@@ -3167,7 +3167,7 @@
             <w:webHidden/>
             <w:sz w:val="21"/>
           </w:rPr>
-          <w:instrText>PAGEREF _Toc240182094 \h</w:instrText>
+          <w:instrText>PAGEREF _Toc240186997 \h</w:instrText>
         </w:r>
         <w:r>
           <w:rPr>
@@ -3232,7 +3232,7 @@
           <w14:ligatures w14:val="standardContextual"/>
         </w:rPr>
       </w:pPr>
-      <w:hyperlink w:anchor="_Toc240182095" w:history="1">
+      <w:hyperlink w:anchor="_Toc240186998" w:history="1">
         <w:r>
           <w:rPr>
             <w:rStyle w:val="aff9"/>
@@ -3284,7 +3284,7 @@
             <w:webHidden/>
             <w:sz w:val="21"/>
           </w:rPr>
-          <w:instrText>PAGEREF _Toc240182095 \h</w:instrText>
+          <w:instrText>PAGEREF _Toc240186998 \h</w:instrText>
         </w:r>
         <w:r>
           <w:rPr>
@@ -3348,7 +3348,7 @@
           <w14:ligatures w14:val="standardContextual"/>
         </w:rPr>
       </w:pPr>
-      <w:hyperlink w:anchor="_Toc240182096" w:history="1">
+      <w:hyperlink w:anchor="_Toc240186999" w:history="1">
         <w:r>
           <w:rPr>
             <w:rStyle w:val="aff9"/>
@@ -3400,7 +3400,7 @@
             <w:webHidden/>
             <w:sz w:val="21"/>
           </w:rPr>
-          <w:instrText>PAGEREF _Toc240182096 \h</w:instrText>
+          <w:instrText>PAGEREF _Toc240186999 \h</w:instrText>
         </w:r>
         <w:r>
           <w:rPr>
@@ -3465,7 +3465,7 @@
           <w14:ligatures w14:val="standardContextual"/>
         </w:rPr>
       </w:pPr>
-      <w:hyperlink w:anchor="_Toc240182097" w:history="1">
+      <w:hyperlink w:anchor="_Toc240187000" w:history="1">
         <w:r>
           <w:rPr>
             <w:rStyle w:val="aff9"/>
@@ -3517,7 +3517,7 @@
             <w:webHidden/>
             <w:sz w:val="21"/>
           </w:rPr>
-          <w:instrText>PAGEREF _Toc240182097 \h</w:instrText>
+          <w:instrText>PAGEREF _Toc240187000 \h</w:instrText>
         </w:r>
         <w:r>
           <w:rPr>
@@ -3582,7 +3582,7 @@
           <w14:ligatures w14:val="standardContextual"/>
         </w:rPr>
       </w:pPr>
-      <w:hyperlink w:anchor="_Toc240182098" w:history="1">
+      <w:hyperlink w:anchor="_Toc240187001" w:history="1">
         <w:r>
           <w:rPr>
             <w:rStyle w:val="aff9"/>
@@ -3634,7 +3634,7 @@
             <w:webHidden/>
             <w:sz w:val="21"/>
           </w:rPr>
-          <w:instrText>PAGEREF _Toc240182098 \h</w:instrText>
+          <w:instrText>PAGEREF _Toc240187001 \h</w:instrText>
         </w:r>
         <w:r>
           <w:rPr>
@@ -3699,7 +3699,7 @@
           <w14:ligatures w14:val="standardContextual"/>
         </w:rPr>
       </w:pPr>
-      <w:hyperlink w:anchor="_Toc240182099" w:history="1">
+      <w:hyperlink w:anchor="_Toc240187002" w:history="1">
         <w:r>
           <w:rPr>
             <w:rStyle w:val="aff9"/>
@@ -3751,7 +3751,7 @@
             <w:webHidden/>
             <w:sz w:val="21"/>
           </w:rPr>
-          <w:instrText>PAGEREF _Toc240182099 \h</w:instrText>
+          <w:instrText>PAGEREF _Toc240187002 \h</w:instrText>
         </w:r>
         <w:r>
           <w:rPr>
@@ -3816,7 +3816,7 @@
           <w14:ligatures w14:val="standardContextual"/>
         </w:rPr>
       </w:pPr>
-      <w:hyperlink w:anchor="_Toc240182100" w:history="1">
+      <w:hyperlink w:anchor="_Toc240187003" w:history="1">
         <w:r>
           <w:rPr>
             <w:rStyle w:val="aff9"/>
@@ -3868,7 +3868,7 @@
             <w:webHidden/>
             <w:sz w:val="21"/>
           </w:rPr>
-          <w:instrText>PAGEREF _Toc240182100 \h</w:instrText>
+          <w:instrText>PAGEREF _Toc240187003 \h</w:instrText>
         </w:r>
         <w:r>
           <w:rPr>
@@ -3933,7 +3933,7 @@
           <w14:ligatures w14:val="standardContextual"/>
         </w:rPr>
       </w:pPr>
-      <w:hyperlink w:anchor="_Toc240182101" w:history="1">
+      <w:hyperlink w:anchor="_Toc240187004" w:history="1">
         <w:r>
           <w:rPr>
             <w:rStyle w:val="aff9"/>
@@ -3985,7 +3985,7 @@
             <w:webHidden/>
             <w:sz w:val="21"/>
           </w:rPr>
-          <w:instrText>PAGEREF _Toc240182101 \h</w:instrText>
+          <w:instrText>PAGEREF _Toc240187004 \h</w:instrText>
         </w:r>
         <w:r>
           <w:rPr>
@@ -4050,7 +4050,7 @@
           <w14:ligatures w14:val="standardContextual"/>
         </w:rPr>
       </w:pPr>
-      <w:hyperlink w:anchor="_Toc240182102" w:history="1">
+      <w:hyperlink w:anchor="_Toc240187005" w:history="1">
         <w:r>
           <w:rPr>
             <w:rStyle w:val="aff9"/>
@@ -4102,7 +4102,7 @@
             <w:webHidden/>
             <w:sz w:val="21"/>
           </w:rPr>
-          <w:instrText>PAGEREF _Toc240182102 \h</w:instrText>
+          <w:instrText>PAGEREF _Toc240187005 \h</w:instrText>
         </w:r>
         <w:r>
           <w:rPr>
@@ -4167,7 +4167,7 @@
           <w14:ligatures w14:val="standardContextual"/>
         </w:rPr>
       </w:pPr>
-      <w:hyperlink w:anchor="_Toc240182103" w:history="1">
+      <w:hyperlink w:anchor="_Toc240187006" w:history="1">
         <w:r>
           <w:rPr>
             <w:rStyle w:val="aff9"/>
@@ -4219,7 +4219,7 @@
             <w:webHidden/>
             <w:sz w:val="21"/>
           </w:rPr>
-          <w:instrText>PAGEREF _Toc240182103 \h</w:instrText>
+          <w:instrText>PAGEREF _Toc240187006 \h</w:instrText>
         </w:r>
         <w:r>
           <w:rPr>
@@ -4284,7 +4284,7 @@
           <w14:ligatures w14:val="standardContextual"/>
         </w:rPr>
       </w:pPr>
-      <w:hyperlink w:anchor="_Toc240182104" w:history="1">
+      <w:hyperlink w:anchor="_Toc240187007" w:history="1">
         <w:r>
           <w:rPr>
             <w:rStyle w:val="aff9"/>
@@ -4354,7 +4354,7 @@
             <w:webHidden/>
             <w:sz w:val="21"/>
           </w:rPr>
-          <w:instrText>PAGEREF _Toc240182104 \h</w:instrText>
+          <w:instrText>PAGEREF _Toc240187007 \h</w:instrText>
         </w:r>
         <w:r>
           <w:rPr>
@@ -4419,7 +4419,7 @@
           <w14:ligatures w14:val="standardContextual"/>
         </w:rPr>
       </w:pPr>
-      <w:hyperlink w:anchor="_Toc240182105" w:history="1">
+      <w:hyperlink w:anchor="_Toc240187008" w:history="1">
         <w:r>
           <w:rPr>
             <w:rStyle w:val="aff9"/>
@@ -4471,7 +4471,7 @@
             <w:webHidden/>
             <w:sz w:val="21"/>
           </w:rPr>
-          <w:instrText>PAGEREF _Toc240182105 \h</w:instrText>
+          <w:instrText>PAGEREF _Toc240187008 \h</w:instrText>
         </w:r>
         <w:r>
           <w:rPr>
@@ -4535,7 +4535,7 @@
           <w14:ligatures w14:val="standardContextual"/>
         </w:rPr>
       </w:pPr>
-      <w:hyperlink w:anchor="_Toc240182106" w:history="1">
+      <w:hyperlink w:anchor="_Toc240187009" w:history="1">
         <w:r>
           <w:rPr>
             <w:rStyle w:val="aff9"/>
@@ -4587,7 +4587,7 @@
             <w:webHidden/>
             <w:sz w:val="21"/>
           </w:rPr>
-          <w:instrText>PAGEREF _Toc240182106 \h</w:instrText>
+          <w:instrText>PAGEREF _Toc240187009 \h</w:instrText>
         </w:r>
         <w:r>
           <w:rPr>
@@ -4652,7 +4652,7 @@
           <w14:ligatures w14:val="standardContextual"/>
         </w:rPr>
       </w:pPr>
-      <w:hyperlink w:anchor="_Toc240182107" w:history="1">
+      <w:hyperlink w:anchor="_Toc240187010" w:history="1">
         <w:r>
           <w:rPr>
             <w:rStyle w:val="aff9"/>
@@ -4704,7 +4704,7 @@
             <w:webHidden/>
             <w:sz w:val="21"/>
           </w:rPr>
-          <w:instrText>PAGEREF _Toc240182107 \h</w:instrText>
+          <w:instrText>PAGEREF _Toc240187010 \h</w:instrText>
         </w:r>
         <w:r>
           <w:rPr>
@@ -4769,7 +4769,7 @@
           <w14:ligatures w14:val="standardContextual"/>
         </w:rPr>
       </w:pPr>
-      <w:hyperlink w:anchor="_Toc240182108" w:history="1">
+      <w:hyperlink w:anchor="_Toc240187011" w:history="1">
         <w:r>
           <w:rPr>
             <w:rStyle w:val="aff9"/>
@@ -4821,7 +4821,7 @@
             <w:webHidden/>
             <w:sz w:val="21"/>
           </w:rPr>
-          <w:instrText>PAGEREF _Toc240182108 \h</w:instrText>
+          <w:instrText>PAGEREF _Toc240187011 \h</w:instrText>
         </w:r>
         <w:r>
           <w:rPr>
@@ -4885,7 +4885,7 @@
           <w14:ligatures w14:val="standardContextual"/>
         </w:rPr>
       </w:pPr>
-      <w:hyperlink w:anchor="_Toc240182109" w:history="1">
+      <w:hyperlink w:anchor="_Toc240187012" w:history="1">
         <w:r>
           <w:rPr>
             <w:rStyle w:val="aff9"/>
@@ -4946,7 +4946,7 @@
             <w:webHidden/>
             <w:sz w:val="21"/>
           </w:rPr>
-          <w:instrText>PAGEREF _Toc240182109 \h</w:instrText>
+          <w:instrText>PAGEREF _Toc240187012 \h</w:instrText>
         </w:r>
         <w:r>
           <w:rPr>
@@ -5010,7 +5010,7 @@
           <w14:ligatures w14:val="standardContextual"/>
         </w:rPr>
       </w:pPr>
-      <w:hyperlink w:anchor="_Toc240182110" w:history="1">
+      <w:hyperlink w:anchor="_Toc240187013" w:history="1">
         <w:r>
           <w:rPr>
             <w:rStyle w:val="aff9"/>
@@ -5053,7 +5053,7 @@
             <w:webHidden/>
             <w:sz w:val="21"/>
           </w:rPr>
-          <w:instrText>PAGEREF _Toc240182110 \h</w:instrText>
+          <w:instrText>PAGEREF _Toc240187013 \h</w:instrText>
         </w:r>
         <w:r>
           <w:rPr>
@@ -5130,7 +5130,7 @@
         <w:pStyle w:val="1"/>
         <w:spacing w:before="0" w:after="160"/>
       </w:pPr>
-      <w:bookmarkStart w:id="2" w:name="_Toc240182074"/>
+      <w:bookmarkStart w:id="2" w:name="_Toc240186977"/>
       <w:r>
         <w:rPr>
           <w:rFonts w:ascii="Times New Roman" w:eastAsia="黑体" w:hAnsi="Times New Roman"/>
@@ -5153,7 +5153,7 @@
         <w:pStyle w:val="21"/>
         <w:spacing w:before="240" w:after="160"/>
       </w:pPr>
-      <w:bookmarkStart w:id="3" w:name="_Toc240182075"/>
+      <w:bookmarkStart w:id="3" w:name="_Toc240186978"/>
       <w:r>
         <w:rPr>
           <w:rFonts w:ascii="Times New Roman" w:eastAsia="黑体" w:hAnsi="Times New Roman"/>
@@ -5284,7 +5284,7 @@
         <w:pStyle w:val="21"/>
         <w:spacing w:before="240" w:after="160"/>
       </w:pPr>
-      <w:bookmarkStart w:id="4" w:name="_Toc240182076"/>
+      <w:bookmarkStart w:id="4" w:name="_Toc240186979"/>
       <w:r>
         <w:rPr>
           <w:rFonts w:ascii="Times New Roman" w:eastAsia="黑体" w:hAnsi="Times New Roman"/>
@@ -5379,7 +5379,7 @@
         <w:pStyle w:val="21"/>
         <w:spacing w:before="240" w:after="160"/>
       </w:pPr>
-      <w:bookmarkStart w:id="5" w:name="_Toc240182077"/>
+      <w:bookmarkStart w:id="5" w:name="_Toc240186980"/>
       <w:r>
         <w:rPr>
           <w:rFonts w:ascii="Times New Roman" w:eastAsia="黑体" w:hAnsi="Times New Roman"/>
@@ -5468,7 +5468,7 @@
           <w:noProof/>
         </w:rPr>
         <w:drawing>
-          <wp:inline distT="0" distB="0" distL="0" distR="0" wp14:anchorId="6DCD21F3" wp14:editId="719C659B">
+          <wp:inline distT="0" distB="0" distL="0" distR="0" wp14:anchorId="36E9BC4B" wp14:editId="3FE957C5">
             <wp:extent cx="5472000" cy="2979200"/>
             <wp:effectExtent l="0" t="0" r="0" b="0"/>
             <wp:docPr id="1" name="Picture 1"/>
@@ -5537,7 +5537,7 @@
         <w:pageBreakBefore/>
         <w:spacing w:before="0" w:after="160"/>
       </w:pPr>
-      <w:bookmarkStart w:id="6" w:name="_Toc240182078"/>
+      <w:bookmarkStart w:id="6" w:name="_Toc240186981"/>
       <w:r>
         <w:rPr>
           <w:rFonts w:ascii="Times New Roman" w:eastAsia="黑体" w:hAnsi="Times New Roman"/>
@@ -5560,7 +5560,7 @@
         <w:pStyle w:val="21"/>
         <w:spacing w:before="240" w:after="160"/>
       </w:pPr>
-      <w:bookmarkStart w:id="7" w:name="_Toc240182079"/>
+      <w:bookmarkStart w:id="7" w:name="_Toc240186982"/>
       <w:r>
         <w:rPr>
           <w:rFonts w:ascii="Times New Roman" w:eastAsia="黑体" w:hAnsi="Times New Roman"/>
@@ -5654,7 +5654,7 @@
         <w:pStyle w:val="21"/>
         <w:spacing w:before="240" w:after="160"/>
       </w:pPr>
-      <w:bookmarkStart w:id="8" w:name="_Toc240182080"/>
+      <w:bookmarkStart w:id="8" w:name="_Toc240186983"/>
       <w:r>
         <w:rPr>
           <w:rFonts w:ascii="Times New Roman" w:eastAsia="黑体" w:hAnsi="Times New Roman"/>
@@ -5948,7 +5948,7 @@
         <w:pStyle w:val="21"/>
         <w:spacing w:before="240" w:after="160"/>
       </w:pPr>
-      <w:bookmarkStart w:id="9" w:name="_Toc240182081"/>
+      <w:bookmarkStart w:id="9" w:name="_Toc240186984"/>
       <w:r>
         <w:rPr>
           <w:rFonts w:ascii="Times New Roman" w:eastAsia="黑体" w:hAnsi="Times New Roman"/>
@@ -6122,7 +6122,7 @@
         <w:pStyle w:val="21"/>
         <w:spacing w:before="240" w:after="160"/>
       </w:pPr>
-      <w:bookmarkStart w:id="10" w:name="_Toc240182082"/>
+      <w:bookmarkStart w:id="10" w:name="_Toc240186985"/>
       <w:r>
         <w:rPr>
           <w:rFonts w:ascii="Times New Roman" w:eastAsia="黑体" w:hAnsi="Times New Roman"/>
@@ -6230,7 +6230,7 @@
         <w:pageBreakBefore/>
         <w:spacing w:before="0" w:after="160"/>
       </w:pPr>
-      <w:bookmarkStart w:id="11" w:name="_Toc240182083"/>
+      <w:bookmarkStart w:id="11" w:name="_Toc240186986"/>
       <w:r>
         <w:rPr>
           <w:rFonts w:ascii="Times New Roman" w:eastAsia="黑体" w:hAnsi="Times New Roman"/>
@@ -6253,7 +6253,7 @@
         <w:pStyle w:val="21"/>
         <w:spacing w:before="240" w:after="160"/>
       </w:pPr>
-      <w:bookmarkStart w:id="12" w:name="_Toc240182084"/>
+      <w:bookmarkStart w:id="12" w:name="_Toc240186987"/>
       <w:r>
         <w:rPr>
           <w:rFonts w:ascii="Times New Roman" w:eastAsia="黑体" w:hAnsi="Times New Roman"/>
@@ -7005,7 +7005,7 @@
         <w:pStyle w:val="21"/>
         <w:spacing w:before="240" w:after="160"/>
       </w:pPr>
-      <w:bookmarkStart w:id="13" w:name="_Toc240182085"/>
+      <w:bookmarkStart w:id="13" w:name="_Toc240186988"/>
       <w:r>
         <w:rPr>
           <w:rFonts w:ascii="Times New Roman" w:eastAsia="黑体" w:hAnsi="Times New Roman"/>
@@ -7682,7 +7682,7 @@
         <w:pStyle w:val="21"/>
         <w:spacing w:before="240" w:after="160"/>
       </w:pPr>
-      <w:bookmarkStart w:id="14" w:name="_Toc240182086"/>
+      <w:bookmarkStart w:id="14" w:name="_Toc240186989"/>
       <w:r>
         <w:rPr>
           <w:rFonts w:ascii="Times New Roman" w:eastAsia="黑体" w:hAnsi="Times New Roman"/>
@@ -8057,7 +8057,7 @@
           <w:noProof/>
         </w:rPr>
         <w:drawing>
-          <wp:inline distT="0" distB="0" distL="0" distR="0" wp14:anchorId="17F2E5AB" wp14:editId="5C619C6C">
+          <wp:inline distT="0" distB="0" distL="0" distR="0" wp14:anchorId="75D90830" wp14:editId="221C21A9">
             <wp:extent cx="5472000" cy="2656564"/>
             <wp:effectExtent l="0" t="0" r="0" b="0"/>
             <wp:docPr id="2" name="Picture 2"/>
@@ -8260,7 +8260,7 @@
         <w:pStyle w:val="21"/>
         <w:spacing w:before="240" w:after="160"/>
       </w:pPr>
-      <w:bookmarkStart w:id="15" w:name="_Toc240182087"/>
+      <w:bookmarkStart w:id="15" w:name="_Toc240186990"/>
       <w:r>
         <w:rPr>
           <w:rFonts w:ascii="Times New Roman" w:eastAsia="黑体" w:hAnsi="Times New Roman"/>
@@ -8440,7 +8440,7 @@
         <w:pStyle w:val="21"/>
         <w:spacing w:before="240" w:after="160"/>
       </w:pPr>
-      <w:bookmarkStart w:id="16" w:name="_Toc240182088"/>
+      <w:bookmarkStart w:id="16" w:name="_Toc240186991"/>
       <w:r>
         <w:rPr>
           <w:rFonts w:ascii="Times New Roman" w:eastAsia="黑体" w:hAnsi="Times New Roman"/>
@@ -8826,7 +8826,7 @@
         <w:pStyle w:val="21"/>
         <w:spacing w:before="240" w:after="160"/>
       </w:pPr>
-      <w:bookmarkStart w:id="17" w:name="_Toc240182089"/>
+      <w:bookmarkStart w:id="17" w:name="_Toc240186992"/>
       <w:r>
         <w:rPr>
           <w:rFonts w:ascii="Times New Roman" w:eastAsia="黑体" w:hAnsi="Times New Roman"/>
@@ -9302,7 +9302,7 @@
         <w:pageBreakBefore/>
         <w:spacing w:before="0" w:after="160"/>
       </w:pPr>
-      <w:bookmarkStart w:id="18" w:name="_Toc240182090"/>
+      <w:bookmarkStart w:id="18" w:name="_Toc240186993"/>
       <w:r>
         <w:rPr>
           <w:rFonts w:ascii="Times New Roman" w:eastAsia="黑体" w:hAnsi="Times New Roman"/>
@@ -9325,7 +9325,7 @@
         <w:pStyle w:val="21"/>
         <w:spacing w:before="240" w:after="160"/>
       </w:pPr>
-      <w:bookmarkStart w:id="19" w:name="_Toc240182091"/>
+      <w:bookmarkStart w:id="19" w:name="_Toc240186994"/>
       <w:r>
         <w:rPr>
           <w:rFonts w:ascii="Times New Roman" w:eastAsia="黑体" w:hAnsi="Times New Roman"/>
@@ -9940,7 +9940,7 @@
         <w:pStyle w:val="21"/>
         <w:spacing w:before="240" w:after="160"/>
       </w:pPr>
-      <w:bookmarkStart w:id="20" w:name="_Toc240182092"/>
+      <w:bookmarkStart w:id="20" w:name="_Toc240186995"/>
       <w:r>
         <w:rPr>
           <w:rFonts w:ascii="Times New Roman" w:eastAsia="黑体" w:hAnsi="Times New Roman"/>
@@ -11517,7 +11517,7 @@
         <w:pStyle w:val="21"/>
         <w:spacing w:before="240" w:after="160"/>
       </w:pPr>
-      <w:bookmarkStart w:id="21" w:name="_Toc240182093"/>
+      <w:bookmarkStart w:id="21" w:name="_Toc240186996"/>
       <w:r>
         <w:rPr>
           <w:rFonts w:ascii="Times New Roman" w:eastAsia="黑体" w:hAnsi="Times New Roman"/>
@@ -12114,7 +12114,7 @@
         <w:pStyle w:val="21"/>
         <w:spacing w:before="240" w:after="160"/>
       </w:pPr>
-      <w:bookmarkStart w:id="22" w:name="_Toc240182094"/>
+      <w:bookmarkStart w:id="22" w:name="_Toc240186997"/>
       <w:r>
         <w:rPr>
           <w:rFonts w:ascii="Times New Roman" w:eastAsia="黑体" w:hAnsi="Times New Roman"/>
@@ -12576,7 +12576,7 @@
         <w:pStyle w:val="21"/>
         <w:spacing w:before="240" w:after="160"/>
       </w:pPr>
-      <w:bookmarkStart w:id="23" w:name="_Toc240182095"/>
+      <w:bookmarkStart w:id="23" w:name="_Toc240186998"/>
       <w:r>
         <w:rPr>
           <w:rFonts w:ascii="Times New Roman" w:eastAsia="黑体" w:hAnsi="Times New Roman"/>
@@ -12841,7 +12841,7 @@
         <w:pageBreakBefore/>
         <w:spacing w:before="0" w:after="160"/>
       </w:pPr>
-      <w:bookmarkStart w:id="24" w:name="_Toc240182096"/>
+      <w:bookmarkStart w:id="24" w:name="_Toc240186999"/>
       <w:r>
         <w:rPr>
           <w:rFonts w:ascii="Times New Roman" w:eastAsia="黑体" w:hAnsi="Times New Roman"/>
@@ -12864,7 +12864,7 @@
         <w:pStyle w:val="21"/>
         <w:spacing w:before="240" w:after="160"/>
       </w:pPr>
-      <w:bookmarkStart w:id="25" w:name="_Toc240182097"/>
+      <w:bookmarkStart w:id="25" w:name="_Toc240187000"/>
       <w:r>
         <w:rPr>
           <w:rFonts w:ascii="Times New Roman" w:eastAsia="黑体" w:hAnsi="Times New Roman"/>
@@ -14217,7 +14217,7 @@
         </w:rPr>
         <w:lastRenderedPageBreak/>
         <w:drawing>
-          <wp:inline distT="0" distB="0" distL="0" distR="0" wp14:anchorId="27BACA21" wp14:editId="43E9273C">
+          <wp:inline distT="0" distB="0" distL="0" distR="0" wp14:anchorId="2C440C90" wp14:editId="49A2C4AE">
             <wp:extent cx="5472000" cy="2577091"/>
             <wp:effectExtent l="0" t="0" r="0" b="0"/>
             <wp:docPr id="3" name="Picture 3"/>
@@ -14298,7 +14298,7 @@
         <w:pStyle w:val="21"/>
         <w:spacing w:before="240" w:after="160"/>
       </w:pPr>
-      <w:bookmarkStart w:id="26" w:name="_Toc240182098"/>
+      <w:bookmarkStart w:id="26" w:name="_Toc240187001"/>
       <w:r>
         <w:rPr>
           <w:rFonts w:ascii="Times New Roman" w:eastAsia="黑体" w:hAnsi="Times New Roman"/>
@@ -15303,7 +15303,7 @@
         </w:rPr>
         <w:lastRenderedPageBreak/>
         <w:drawing>
-          <wp:inline distT="0" distB="0" distL="0" distR="0" wp14:anchorId="6292FB11" wp14:editId="3BB6A5F3">
+          <wp:inline distT="0" distB="0" distL="0" distR="0" wp14:anchorId="04603549" wp14:editId="79E8DE79">
             <wp:extent cx="5472000" cy="2793527"/>
             <wp:effectExtent l="0" t="0" r="0" b="0"/>
             <wp:docPr id="4" name="Picture 4"/>
@@ -16279,7 +16279,7 @@
         </w:rPr>
         <w:lastRenderedPageBreak/>
         <w:drawing>
-          <wp:inline distT="0" distB="0" distL="0" distR="0" wp14:anchorId="69092EE5" wp14:editId="2058FC4E">
+          <wp:inline distT="0" distB="0" distL="0" distR="0" wp14:anchorId="75ABC78F" wp14:editId="5A139FAD">
             <wp:extent cx="5472000" cy="2687596"/>
             <wp:effectExtent l="0" t="0" r="0" b="0"/>
             <wp:docPr id="5" name="Picture 5"/>
@@ -16347,7 +16347,7 @@
         <w:pStyle w:val="21"/>
         <w:spacing w:before="240" w:after="160"/>
       </w:pPr>
-      <w:bookmarkStart w:id="27" w:name="_Toc240182099"/>
+      <w:bookmarkStart w:id="27" w:name="_Toc240187002"/>
       <w:r>
         <w:rPr>
           <w:rFonts w:ascii="Times New Roman" w:eastAsia="黑体" w:hAnsi="Times New Roman"/>
@@ -18757,7 +18757,7 @@
         </w:rPr>
         <w:lastRenderedPageBreak/>
         <w:drawing>
-          <wp:inline distT="0" distB="0" distL="0" distR="0" wp14:anchorId="10D41282" wp14:editId="32D6B45C">
+          <wp:inline distT="0" distB="0" distL="0" distR="0" wp14:anchorId="3DE18AE3" wp14:editId="1099F48B">
             <wp:extent cx="5472000" cy="2599966"/>
             <wp:effectExtent l="0" t="0" r="0" b="0"/>
             <wp:docPr id="6" name="Picture 6"/>
@@ -18825,7 +18825,7 @@
         <w:pStyle w:val="21"/>
         <w:spacing w:before="240" w:after="160"/>
       </w:pPr>
-      <w:bookmarkStart w:id="28" w:name="_Toc240182100"/>
+      <w:bookmarkStart w:id="28" w:name="_Toc240187003"/>
       <w:r>
         <w:rPr>
           <w:rFonts w:ascii="Times New Roman" w:eastAsia="黑体" w:hAnsi="Times New Roman"/>
@@ -20380,7 +20380,7 @@
           <w:noProof/>
         </w:rPr>
         <w:drawing>
-          <wp:inline distT="0" distB="0" distL="0" distR="0" wp14:anchorId="71D1EA90" wp14:editId="1D20788C">
+          <wp:inline distT="0" distB="0" distL="0" distR="0" wp14:anchorId="7D47364F" wp14:editId="2FFB6F49">
             <wp:extent cx="5472000" cy="2238165"/>
             <wp:effectExtent l="0" t="0" r="0" b="0"/>
             <wp:docPr id="7" name="Picture 7"/>
@@ -21892,7 +21892,7 @@
         <w:pStyle w:val="21"/>
         <w:spacing w:before="240" w:after="160"/>
       </w:pPr>
-      <w:bookmarkStart w:id="29" w:name="_Toc240182101"/>
+      <w:bookmarkStart w:id="29" w:name="_Toc240187004"/>
       <w:r>
         <w:rPr>
           <w:rFonts w:ascii="Times New Roman" w:eastAsia="黑体" w:hAnsi="Times New Roman"/>
@@ -22194,7 +22194,7 @@
         <w:pStyle w:val="21"/>
         <w:spacing w:before="240" w:after="160"/>
       </w:pPr>
-      <w:bookmarkStart w:id="30" w:name="_Toc240182102"/>
+      <w:bookmarkStart w:id="30" w:name="_Toc240187005"/>
       <w:r>
         <w:rPr>
           <w:rFonts w:ascii="Times New Roman" w:eastAsia="黑体" w:hAnsi="Times New Roman"/>
@@ -22462,7 +22462,7 @@
         </w:rPr>
         <w:lastRenderedPageBreak/>
         <w:drawing>
-          <wp:inline distT="0" distB="0" distL="0" distR="0" wp14:anchorId="01BD4B6F" wp14:editId="56039A1E">
+          <wp:inline distT="0" distB="0" distL="0" distR="0" wp14:anchorId="5BE8FD4A" wp14:editId="1449DB73">
             <wp:extent cx="5472000" cy="2389419"/>
             <wp:effectExtent l="0" t="0" r="0" b="0"/>
             <wp:docPr id="8" name="Picture 8"/>
@@ -22986,7 +22986,7 @@
         </w:rPr>
         <w:lastRenderedPageBreak/>
         <w:drawing>
-          <wp:inline distT="0" distB="0" distL="0" distR="0" wp14:anchorId="633C64F6" wp14:editId="1EFA3013">
+          <wp:inline distT="0" distB="0" distL="0" distR="0" wp14:anchorId="70747CE7" wp14:editId="3FE8979D">
             <wp:extent cx="5472000" cy="2290994"/>
             <wp:effectExtent l="0" t="0" r="0" b="0"/>
             <wp:docPr id="9" name="Picture 9"/>
@@ -23054,7 +23054,7 @@
         <w:pStyle w:val="21"/>
         <w:spacing w:before="240" w:after="160"/>
       </w:pPr>
-      <w:bookmarkStart w:id="31" w:name="_Toc240182103"/>
+      <w:bookmarkStart w:id="31" w:name="_Toc240187006"/>
       <w:r>
         <w:rPr>
           <w:rFonts w:ascii="Times New Roman" w:eastAsia="黑体" w:hAnsi="Times New Roman"/>
@@ -23104,7 +23104,7 @@
           <w:noProof/>
         </w:rPr>
         <w:drawing>
-          <wp:inline distT="0" distB="0" distL="0" distR="0" wp14:anchorId="7F13024B" wp14:editId="174BFCB2">
+          <wp:inline distT="0" distB="0" distL="0" distR="0" wp14:anchorId="590D38E0" wp14:editId="6B4BD738">
             <wp:extent cx="5472000" cy="2251206"/>
             <wp:effectExtent l="0" t="0" r="0" b="0"/>
             <wp:docPr id="10" name="Picture 10"/>
@@ -24284,7 +24284,7 @@
         <w:pStyle w:val="21"/>
         <w:spacing w:before="240" w:after="160"/>
       </w:pPr>
-      <w:bookmarkStart w:id="32" w:name="_Toc240182104"/>
+      <w:bookmarkStart w:id="32" w:name="_Toc240187007"/>
       <w:r>
         <w:rPr>
           <w:rFonts w:ascii="Times New Roman" w:eastAsia="黑体" w:hAnsi="Times New Roman"/>
@@ -24662,7 +24662,7 @@
         <w:pStyle w:val="21"/>
         <w:spacing w:before="240" w:after="160"/>
       </w:pPr>
-      <w:bookmarkStart w:id="33" w:name="_Toc240182105"/>
+      <w:bookmarkStart w:id="33" w:name="_Toc240187008"/>
       <w:r>
         <w:rPr>
           <w:rFonts w:ascii="Times New Roman" w:eastAsia="黑体" w:hAnsi="Times New Roman"/>
@@ -24880,7 +24880,7 @@
         <w:pageBreakBefore/>
         <w:spacing w:before="0" w:after="160"/>
       </w:pPr>
-      <w:bookmarkStart w:id="34" w:name="_Toc240182106"/>
+      <w:bookmarkStart w:id="34" w:name="_Toc240187009"/>
       <w:r>
         <w:rPr>
           <w:rFonts w:ascii="Times New Roman" w:eastAsia="黑体" w:hAnsi="Times New Roman"/>
@@ -24903,7 +24903,7 @@
         <w:pStyle w:val="21"/>
         <w:spacing w:before="240" w:after="160"/>
       </w:pPr>
-      <w:bookmarkStart w:id="35" w:name="_Toc240182107"/>
+      <w:bookmarkStart w:id="35" w:name="_Toc240187010"/>
       <w:r>
         <w:rPr>
           <w:rFonts w:ascii="Times New Roman" w:eastAsia="黑体" w:hAnsi="Times New Roman"/>
@@ -25179,7 +25179,7 @@
         <w:pStyle w:val="21"/>
         <w:spacing w:before="240" w:after="160"/>
       </w:pPr>
-      <w:bookmarkStart w:id="36" w:name="_Toc240182108"/>
+      <w:bookmarkStart w:id="36" w:name="_Toc240187011"/>
       <w:r>
         <w:rPr>
           <w:rFonts w:ascii="Times New Roman" w:eastAsia="黑体" w:hAnsi="Times New Roman"/>
@@ -25251,7 +25251,7 @@
         <w:pageBreakBefore/>
         <w:spacing w:before="0" w:after="160"/>
       </w:pPr>
-      <w:bookmarkStart w:id="37" w:name="_Toc240182109"/>
+      <w:bookmarkStart w:id="37" w:name="_Toc240187012"/>
       <w:r>
         <w:rPr>
           <w:rFonts w:ascii="Times New Roman" w:eastAsia="黑体" w:hAnsi="Times New Roman"/>
@@ -25420,7 +25420,31 @@
         <w:rPr>
           <w:color w:val="000000"/>
         </w:rPr>
-        <w:t>项目提供本地源码与结果复现包、依赖版本清单及</w:t>
+        <w:t>项目代码、竞赛数据、已保存模型、实验结果、图表和论文发布于公开</w:t>
+      </w:r>
+      <w:r>
+        <w:rPr>
+          <w:color w:val="000000"/>
+        </w:rPr>
+        <w:t>GitHub</w:t>
+      </w:r>
+      <w:r>
+        <w:rPr>
+          <w:color w:val="000000"/>
+        </w:rPr>
+        <w:t>仓库</w:t>
+      </w:r>
+      <w:r>
+        <w:rPr>
+          <w:color w:val="000000"/>
+        </w:rPr>
+        <w:t>https://github.com/kagurarnea/-</w:t>
+      </w:r>
+      <w:r>
+        <w:rPr>
+          <w:color w:val="000000"/>
+        </w:rPr>
+        <w:t>。仓库提供依赖版本清单、</w:t>
       </w:r>
       <w:r>
         <w:rPr>
@@ -25432,7 +25456,31 @@
         <w:rPr>
           <w:color w:val="000000"/>
         </w:rPr>
-        <w:t>，包含可执行入口、实验协议、逐记录表格和作图脚本。原始竞赛数据的再次分发许可未确认，因此包内不含</w:t>
+        <w:t>、可执行入口、实验协议、逐记录表格和作图脚本；输入文件可通过清单中的</w:t>
+      </w:r>
+      <w:r>
+        <w:rPr>
+          <w:color w:val="000000"/>
+        </w:rPr>
+        <w:t>SHA256</w:t>
+      </w:r>
+      <w:r>
+        <w:rPr>
+          <w:color w:val="000000"/>
+        </w:rPr>
+        <w:t>核对。原创源码与项目文档采用</w:t>
+      </w:r>
+      <w:r>
+        <w:rPr>
+          <w:color w:val="000000"/>
+        </w:rPr>
+        <w:t>MIT</w:t>
+      </w:r>
+      <w:r>
+        <w:rPr>
+          <w:color w:val="000000"/>
+        </w:rPr>
+        <w:t>许可证，竞赛数据和引用的第三方资料保留其原有权利。另提供不含</w:t>
       </w:r>
       <w:r>
         <w:rPr>
@@ -25444,19 +25492,7 @@
         <w:rPr>
           <w:color w:val="000000"/>
         </w:rPr>
-        <w:t>或可能内嵌数据的模型对象。具备相同数据访问权限的研究者可按文件名与</w:t>
-      </w:r>
-      <w:r>
-        <w:rPr>
-          <w:color w:val="000000"/>
-        </w:rPr>
-        <w:t>SHA256</w:t>
-      </w:r>
-      <w:r>
-        <w:rPr>
-          <w:color w:val="000000"/>
-        </w:rPr>
-        <w:t>放置数据后重跑；没有数据权限时，只能复核已提供预测表对应的统计计算。项目尚未发布公共代码仓库，不将本地资料称为公开在线资源。</w:t>
+        <w:t>和模型对象的精简复现包，便于在不重复分发数据与模型时核查代码和统计结果。</w:t>
       </w:r>
     </w:p>
     <w:p>
@@ -25465,7 +25501,7 @@
         <w:pageBreakBefore/>
         <w:spacing w:before="0" w:after="160"/>
       </w:pPr>
-      <w:bookmarkStart w:id="38" w:name="_Toc240182110"/>
+      <w:bookmarkStart w:id="38" w:name="_Toc240187013"/>
       <w:r>
         <w:rPr>
           <w:rFonts w:ascii="Times New Roman" w:eastAsia="黑体" w:hAnsi="Times New Roman"/>
@@ -26111,31 +26147,31 @@
       </w:rPr>
     </w:lvl>
   </w:abstractNum>
-  <w:num w:numId="1" w16cid:durableId="1421104929">
+  <w:num w:numId="1" w16cid:durableId="1990399684">
     <w:abstractNumId w:val="8"/>
   </w:num>
-  <w:num w:numId="2" w16cid:durableId="466433812">
+  <w:num w:numId="2" w16cid:durableId="1938950194">
     <w:abstractNumId w:val="6"/>
   </w:num>
-  <w:num w:numId="3" w16cid:durableId="204216860">
+  <w:num w:numId="3" w16cid:durableId="1059940640">
     <w:abstractNumId w:val="5"/>
   </w:num>
-  <w:num w:numId="4" w16cid:durableId="2117828332">
+  <w:num w:numId="4" w16cid:durableId="1937447253">
     <w:abstractNumId w:val="4"/>
   </w:num>
-  <w:num w:numId="5" w16cid:durableId="333000468">
+  <w:num w:numId="5" w16cid:durableId="1559589739">
     <w:abstractNumId w:val="7"/>
   </w:num>
-  <w:num w:numId="6" w16cid:durableId="631061449">
+  <w:num w:numId="6" w16cid:durableId="143813764">
     <w:abstractNumId w:val="3"/>
   </w:num>
-  <w:num w:numId="7" w16cid:durableId="1847791203">
+  <w:num w:numId="7" w16cid:durableId="617446700">
     <w:abstractNumId w:val="2"/>
   </w:num>
-  <w:num w:numId="8" w16cid:durableId="212352160">
+  <w:num w:numId="8" w16cid:durableId="1854413722">
     <w:abstractNumId w:val="1"/>
   </w:num>
-  <w:num w:numId="9" w16cid:durableId="34935017">
+  <w:num w:numId="9" w16cid:durableId="1162356243">
     <w:abstractNumId w:val="0"/>
   </w:num>
 </w:numbering>
@@ -37525,7 +37561,7 @@
     <w:autoRedefine/>
     <w:uiPriority w:val="39"/>
     <w:unhideWhenUsed/>
-    <w:rsid w:val="00760BF9"/>
+    <w:rsid w:val="00B8577D"/>
   </w:style>
   <w:style w:type="paragraph" w:styleId="TOC2">
     <w:name w:val="toc 2"/>
@@ -37534,7 +37570,7 @@
     <w:autoRedefine/>
     <w:uiPriority w:val="39"/>
     <w:unhideWhenUsed/>
-    <w:rsid w:val="00760BF9"/>
+    <w:rsid w:val="00B8577D"/>
     <w:pPr>
       <w:ind w:leftChars="200" w:left="420"/>
     </w:pPr>
@@ -37544,7 +37580,7 @@
     <w:basedOn w:val="a2"/>
     <w:uiPriority w:val="99"/>
     <w:unhideWhenUsed/>
-    <w:rsid w:val="00760BF9"/>
+    <w:rsid w:val="00B8577D"/>
     <w:rPr>
       <w:color w:val="0000FF" w:themeColor="hyperlink"/>
       <w:u w:val="single"/>

</xml_diff>